<commit_message>
Fix template to remove 21:15 arvit
</commit_message>
<xml_diff>
--- a/resources/templates/shabbat.docx
+++ b/resources/templates/shabbat.docx
@@ -1,6 +1,6 @@
 
 <file path=word/document.xml><?xml version="1.0" encoding="utf-8"?>
-<w:document xmlns:wpc="http://schemas.microsoft.com/office/word/2010/wordprocessingCanvas" xmlns:cx="http://schemas.microsoft.com/office/drawing/2014/chartex" xmlns:cx1="http://schemas.microsoft.com/office/drawing/2015/9/8/chartex" xmlns:cx2="http://schemas.microsoft.com/office/drawing/2015/10/21/chartex" xmlns:cx3="http://schemas.microsoft.com/office/drawing/2016/5/9/chartex" xmlns:cx4="http://schemas.microsoft.com/office/drawing/2016/5/10/chartex" xmlns:cx5="http://schemas.microsoft.com/office/drawing/2016/5/11/chartex" xmlns:cx6="http://schemas.microsoft.com/office/drawing/2016/5/12/chartex" xmlns:cx7="http://schemas.microsoft.com/office/drawing/2016/5/13/chartex" xmlns:cx8="http://schemas.microsoft.com/office/drawing/2016/5/14/chartex" xmlns:mc="http://schemas.openxmlformats.org/markup-compatibility/2006" xmlns:aink="http://schemas.microsoft.com/office/drawing/2016/ink" xmlns:am3d="http://schemas.microsoft.com/office/drawing/2017/model3d" xmlns:o="urn:schemas-microsoft-com:office:office" xmlns:oel="http://schemas.microsoft.com/office/2019/extlst" xmlns:r="http://schemas.openxmlformats.org/officeDocument/2006/relationships" xmlns:m="http://schemas.openxmlformats.org/officeDocument/2006/math" xmlns:v="urn:schemas-microsoft-com:vml" xmlns:wp14="http://schemas.microsoft.com/office/word/2010/wordprocessingDrawing" xmlns:wp="http://schemas.openxmlformats.org/drawingml/2006/wordprocessingDrawing" xmlns:w10="urn:schemas-microsoft-com:office:word" xmlns:w="http://schemas.openxmlformats.org/wordprocessingml/2006/main" xmlns:w14="http://schemas.microsoft.com/office/word/2010/wordml" xmlns:w15="http://schemas.microsoft.com/office/word/2012/wordml" xmlns:w16cex="http://schemas.microsoft.com/office/word/2018/wordml/cex" xmlns:w16cid="http://schemas.microsoft.com/office/word/2016/wordml/cid" xmlns:w16="http://schemas.microsoft.com/office/word/2018/wordml" xmlns:w16sdtdh="http://schemas.microsoft.com/office/word/2020/wordml/sdtdatahash" xmlns:w16se="http://schemas.microsoft.com/office/word/2015/wordml/symex" xmlns:wpg="http://schemas.microsoft.com/office/word/2010/wordprocessingGroup" xmlns:wpi="http://schemas.microsoft.com/office/word/2010/wordprocessingInk" xmlns:wne="http://schemas.microsoft.com/office/word/2006/wordml" xmlns:wps="http://schemas.microsoft.com/office/word/2010/wordprocessingShape" mc:Ignorable="w14 w15 w16se w16cid w16 w16cex w16sdtdh wp14">
+<w:document xmlns:wpc="http://schemas.microsoft.com/office/word/2010/wordprocessingCanvas" xmlns:cx="http://schemas.microsoft.com/office/drawing/2014/chartex" xmlns:cx1="http://schemas.microsoft.com/office/drawing/2015/9/8/chartex" xmlns:cx2="http://schemas.microsoft.com/office/drawing/2015/10/21/chartex" xmlns:cx3="http://schemas.microsoft.com/office/drawing/2016/5/9/chartex" xmlns:cx4="http://schemas.microsoft.com/office/drawing/2016/5/10/chartex" xmlns:cx5="http://schemas.microsoft.com/office/drawing/2016/5/11/chartex" xmlns:cx6="http://schemas.microsoft.com/office/drawing/2016/5/12/chartex" xmlns:cx7="http://schemas.microsoft.com/office/drawing/2016/5/13/chartex" xmlns:cx8="http://schemas.microsoft.com/office/drawing/2016/5/14/chartex" xmlns:mc="http://schemas.openxmlformats.org/markup-compatibility/2006" xmlns:aink="http://schemas.microsoft.com/office/drawing/2016/ink" xmlns:am3d="http://schemas.microsoft.com/office/drawing/2017/model3d" xmlns:o="urn:schemas-microsoft-com:office:office" xmlns:oel="http://schemas.microsoft.com/office/2019/extlst" xmlns:r="http://schemas.openxmlformats.org/officeDocument/2006/relationships" xmlns:m="http://schemas.openxmlformats.org/officeDocument/2006/math" xmlns:v="urn:schemas-microsoft-com:vml" xmlns:wp14="http://schemas.microsoft.com/office/word/2010/wordprocessingDrawing" xmlns:wp="http://schemas.openxmlformats.org/drawingml/2006/wordprocessingDrawing" xmlns:w10="urn:schemas-microsoft-com:office:word" xmlns:w="http://schemas.openxmlformats.org/wordprocessingml/2006/main" xmlns:w14="http://schemas.microsoft.com/office/word/2010/wordml" xmlns:w15="http://schemas.microsoft.com/office/word/2012/wordml" xmlns:w16cex="http://schemas.microsoft.com/office/word/2018/wordml/cex" xmlns:w16cid="http://schemas.microsoft.com/office/word/2016/wordml/cid" xmlns:w16="http://schemas.microsoft.com/office/word/2018/wordml" xmlns:w16du="http://schemas.microsoft.com/office/word/2023/wordml/word16du" xmlns:w16sdtdh="http://schemas.microsoft.com/office/word/2020/wordml/sdtdatahash" xmlns:w16sdtfl="http://schemas.microsoft.com/office/word/2024/wordml/sdtformatlock" xmlns:w16se="http://schemas.microsoft.com/office/word/2015/wordml/symex" xmlns:wpg="http://schemas.microsoft.com/office/word/2010/wordprocessingGroup" xmlns:wpi="http://schemas.microsoft.com/office/word/2010/wordprocessingInk" xmlns:wne="http://schemas.microsoft.com/office/word/2006/wordml" xmlns:wps="http://schemas.microsoft.com/office/word/2010/wordprocessingShape" mc:Ignorable="w14 w15 w16se w16cid w16 w16cex w16sdtdh w16sdtfl w16du wp14">
   <w:body>
     <w:p>
       <w:pPr>
@@ -1313,25 +1313,6 @@
           <w:szCs w:val="32"/>
         </w:rPr>
         <w:t>{week_arvit_1}</w:t>
-      </w:r>
-      <w:r>
-        <w:rPr>
-          <w:rFonts w:ascii="Tahoma" w:hAnsi="Tahoma" w:cs="Tahoma" w:hint="cs"/>
-          <w:color w:val="864904" w:themeColor="accent3" w:themeShade="80"/>
-          <w:sz w:val="32"/>
-          <w:szCs w:val="32"/>
-          <w:rtl/>
-        </w:rPr>
-        <w:t xml:space="preserve">, </w:t>
-      </w:r>
-      <w:r>
-        <w:rPr>
-          <w:rFonts w:ascii="Tahoma" w:hAnsi="Tahoma" w:cs="Tahoma"/>
-          <w:color w:val="864904" w:themeColor="accent3" w:themeShade="80"/>
-          <w:sz w:val="32"/>
-          <w:szCs w:val="32"/>
-        </w:rPr>
-        <w:t>{week_arvit_2}</w:t>
       </w:r>
     </w:p>
     <w:sectPr>
@@ -1353,7 +1334,7 @@
 </file>
 
 <file path=word/endnotes.xml><?xml version="1.0" encoding="utf-8"?>
-<w:endnotes xmlns:wpc="http://schemas.microsoft.com/office/word/2010/wordprocessingCanvas" xmlns:cx="http://schemas.microsoft.com/office/drawing/2014/chartex" xmlns:cx1="http://schemas.microsoft.com/office/drawing/2015/9/8/chartex" xmlns:cx2="http://schemas.microsoft.com/office/drawing/2015/10/21/chartex" xmlns:cx3="http://schemas.microsoft.com/office/drawing/2016/5/9/chartex" xmlns:cx4="http://schemas.microsoft.com/office/drawing/2016/5/10/chartex" xmlns:cx5="http://schemas.microsoft.com/office/drawing/2016/5/11/chartex" xmlns:cx6="http://schemas.microsoft.com/office/drawing/2016/5/12/chartex" xmlns:cx7="http://schemas.microsoft.com/office/drawing/2016/5/13/chartex" xmlns:cx8="http://schemas.microsoft.com/office/drawing/2016/5/14/chartex" xmlns:mc="http://schemas.openxmlformats.org/markup-compatibility/2006" xmlns:aink="http://schemas.microsoft.com/office/drawing/2016/ink" xmlns:am3d="http://schemas.microsoft.com/office/drawing/2017/model3d" xmlns:o="urn:schemas-microsoft-com:office:office" xmlns:oel="http://schemas.microsoft.com/office/2019/extlst" xmlns:r="http://schemas.openxmlformats.org/officeDocument/2006/relationships" xmlns:m="http://schemas.openxmlformats.org/officeDocument/2006/math" xmlns:v="urn:schemas-microsoft-com:vml" xmlns:wp14="http://schemas.microsoft.com/office/word/2010/wordprocessingDrawing" xmlns:wp="http://schemas.openxmlformats.org/drawingml/2006/wordprocessingDrawing" xmlns:w10="urn:schemas-microsoft-com:office:word" xmlns:w="http://schemas.openxmlformats.org/wordprocessingml/2006/main" xmlns:w14="http://schemas.microsoft.com/office/word/2010/wordml" xmlns:w15="http://schemas.microsoft.com/office/word/2012/wordml" xmlns:w16cex="http://schemas.microsoft.com/office/word/2018/wordml/cex" xmlns:w16cid="http://schemas.microsoft.com/office/word/2016/wordml/cid" xmlns:w16="http://schemas.microsoft.com/office/word/2018/wordml" xmlns:w16sdtdh="http://schemas.microsoft.com/office/word/2020/wordml/sdtdatahash" xmlns:w16se="http://schemas.microsoft.com/office/word/2015/wordml/symex" xmlns:wpg="http://schemas.microsoft.com/office/word/2010/wordprocessingGroup" xmlns:wpi="http://schemas.microsoft.com/office/word/2010/wordprocessingInk" xmlns:wne="http://schemas.microsoft.com/office/word/2006/wordml" xmlns:wps="http://schemas.microsoft.com/office/word/2010/wordprocessingShape" mc:Ignorable="w14 w15 w16se w16cid w16 w16cex w16sdtdh wp14">
+<w:endnotes xmlns:wpc="http://schemas.microsoft.com/office/word/2010/wordprocessingCanvas" xmlns:cx="http://schemas.microsoft.com/office/drawing/2014/chartex" xmlns:cx1="http://schemas.microsoft.com/office/drawing/2015/9/8/chartex" xmlns:cx2="http://schemas.microsoft.com/office/drawing/2015/10/21/chartex" xmlns:cx3="http://schemas.microsoft.com/office/drawing/2016/5/9/chartex" xmlns:cx4="http://schemas.microsoft.com/office/drawing/2016/5/10/chartex" xmlns:cx5="http://schemas.microsoft.com/office/drawing/2016/5/11/chartex" xmlns:cx6="http://schemas.microsoft.com/office/drawing/2016/5/12/chartex" xmlns:cx7="http://schemas.microsoft.com/office/drawing/2016/5/13/chartex" xmlns:cx8="http://schemas.microsoft.com/office/drawing/2016/5/14/chartex" xmlns:mc="http://schemas.openxmlformats.org/markup-compatibility/2006" xmlns:aink="http://schemas.microsoft.com/office/drawing/2016/ink" xmlns:am3d="http://schemas.microsoft.com/office/drawing/2017/model3d" xmlns:o="urn:schemas-microsoft-com:office:office" xmlns:oel="http://schemas.microsoft.com/office/2019/extlst" xmlns:r="http://schemas.openxmlformats.org/officeDocument/2006/relationships" xmlns:m="http://schemas.openxmlformats.org/officeDocument/2006/math" xmlns:v="urn:schemas-microsoft-com:vml" xmlns:wp14="http://schemas.microsoft.com/office/word/2010/wordprocessingDrawing" xmlns:wp="http://schemas.openxmlformats.org/drawingml/2006/wordprocessingDrawing" xmlns:w10="urn:schemas-microsoft-com:office:word" xmlns:w="http://schemas.openxmlformats.org/wordprocessingml/2006/main" xmlns:w14="http://schemas.microsoft.com/office/word/2010/wordml" xmlns:w15="http://schemas.microsoft.com/office/word/2012/wordml" xmlns:w16cex="http://schemas.microsoft.com/office/word/2018/wordml/cex" xmlns:w16cid="http://schemas.microsoft.com/office/word/2016/wordml/cid" xmlns:w16="http://schemas.microsoft.com/office/word/2018/wordml" xmlns:w16du="http://schemas.microsoft.com/office/word/2023/wordml/word16du" xmlns:w16sdtdh="http://schemas.microsoft.com/office/word/2020/wordml/sdtdatahash" xmlns:w16sdtfl="http://schemas.microsoft.com/office/word/2024/wordml/sdtformatlock" xmlns:w16se="http://schemas.microsoft.com/office/word/2015/wordml/symex" xmlns:wpg="http://schemas.microsoft.com/office/word/2010/wordprocessingGroup" xmlns:wpi="http://schemas.microsoft.com/office/word/2010/wordprocessingInk" xmlns:wne="http://schemas.microsoft.com/office/word/2006/wordml" xmlns:wps="http://schemas.microsoft.com/office/word/2010/wordprocessingShape" mc:Ignorable="w14 w15 w16se w16cid w16 w16cex w16sdtdh w16sdtfl w16du wp14">
   <w:endnote w:type="separator" w:id="-1">
     <w:p>
       <w:pPr>
@@ -1378,7 +1359,7 @@
 </file>
 
 <file path=word/footer1.xml><?xml version="1.0" encoding="utf-8"?>
-<w:ftr xmlns:wpc="http://schemas.microsoft.com/office/word/2010/wordprocessingCanvas" xmlns:cx="http://schemas.microsoft.com/office/drawing/2014/chartex" xmlns:cx1="http://schemas.microsoft.com/office/drawing/2015/9/8/chartex" xmlns:cx2="http://schemas.microsoft.com/office/drawing/2015/10/21/chartex" xmlns:cx3="http://schemas.microsoft.com/office/drawing/2016/5/9/chartex" xmlns:cx4="http://schemas.microsoft.com/office/drawing/2016/5/10/chartex" xmlns:cx5="http://schemas.microsoft.com/office/drawing/2016/5/11/chartex" xmlns:cx6="http://schemas.microsoft.com/office/drawing/2016/5/12/chartex" xmlns:cx7="http://schemas.microsoft.com/office/drawing/2016/5/13/chartex" xmlns:cx8="http://schemas.microsoft.com/office/drawing/2016/5/14/chartex" xmlns:mc="http://schemas.openxmlformats.org/markup-compatibility/2006" xmlns:aink="http://schemas.microsoft.com/office/drawing/2016/ink" xmlns:am3d="http://schemas.microsoft.com/office/drawing/2017/model3d" xmlns:o="urn:schemas-microsoft-com:office:office" xmlns:oel="http://schemas.microsoft.com/office/2019/extlst" xmlns:r="http://schemas.openxmlformats.org/officeDocument/2006/relationships" xmlns:m="http://schemas.openxmlformats.org/officeDocument/2006/math" xmlns:v="urn:schemas-microsoft-com:vml" xmlns:wp14="http://schemas.microsoft.com/office/word/2010/wordprocessingDrawing" xmlns:wp="http://schemas.openxmlformats.org/drawingml/2006/wordprocessingDrawing" xmlns:w10="urn:schemas-microsoft-com:office:word" xmlns:w="http://schemas.openxmlformats.org/wordprocessingml/2006/main" xmlns:w14="http://schemas.microsoft.com/office/word/2010/wordml" xmlns:w15="http://schemas.microsoft.com/office/word/2012/wordml" xmlns:w16cex="http://schemas.microsoft.com/office/word/2018/wordml/cex" xmlns:w16cid="http://schemas.microsoft.com/office/word/2016/wordml/cid" xmlns:w16="http://schemas.microsoft.com/office/word/2018/wordml" xmlns:w16sdtdh="http://schemas.microsoft.com/office/word/2020/wordml/sdtdatahash" xmlns:w16se="http://schemas.microsoft.com/office/word/2015/wordml/symex" xmlns:wpg="http://schemas.microsoft.com/office/word/2010/wordprocessingGroup" xmlns:wpi="http://schemas.microsoft.com/office/word/2010/wordprocessingInk" xmlns:wne="http://schemas.microsoft.com/office/word/2006/wordml" xmlns:wps="http://schemas.microsoft.com/office/word/2010/wordprocessingShape" mc:Ignorable="w14 w15 w16se w16cid w16 w16cex w16sdtdh wp14">
+<w:ftr xmlns:wpc="http://schemas.microsoft.com/office/word/2010/wordprocessingCanvas" xmlns:cx="http://schemas.microsoft.com/office/drawing/2014/chartex" xmlns:cx1="http://schemas.microsoft.com/office/drawing/2015/9/8/chartex" xmlns:cx2="http://schemas.microsoft.com/office/drawing/2015/10/21/chartex" xmlns:cx3="http://schemas.microsoft.com/office/drawing/2016/5/9/chartex" xmlns:cx4="http://schemas.microsoft.com/office/drawing/2016/5/10/chartex" xmlns:cx5="http://schemas.microsoft.com/office/drawing/2016/5/11/chartex" xmlns:cx6="http://schemas.microsoft.com/office/drawing/2016/5/12/chartex" xmlns:cx7="http://schemas.microsoft.com/office/drawing/2016/5/13/chartex" xmlns:cx8="http://schemas.microsoft.com/office/drawing/2016/5/14/chartex" xmlns:mc="http://schemas.openxmlformats.org/markup-compatibility/2006" xmlns:aink="http://schemas.microsoft.com/office/drawing/2016/ink" xmlns:am3d="http://schemas.microsoft.com/office/drawing/2017/model3d" xmlns:o="urn:schemas-microsoft-com:office:office" xmlns:oel="http://schemas.microsoft.com/office/2019/extlst" xmlns:r="http://schemas.openxmlformats.org/officeDocument/2006/relationships" xmlns:m="http://schemas.openxmlformats.org/officeDocument/2006/math" xmlns:v="urn:schemas-microsoft-com:vml" xmlns:wp14="http://schemas.microsoft.com/office/word/2010/wordprocessingDrawing" xmlns:wp="http://schemas.openxmlformats.org/drawingml/2006/wordprocessingDrawing" xmlns:w10="urn:schemas-microsoft-com:office:word" xmlns:w="http://schemas.openxmlformats.org/wordprocessingml/2006/main" xmlns:w14="http://schemas.microsoft.com/office/word/2010/wordml" xmlns:w15="http://schemas.microsoft.com/office/word/2012/wordml" xmlns:w16cex="http://schemas.microsoft.com/office/word/2018/wordml/cex" xmlns:w16cid="http://schemas.microsoft.com/office/word/2016/wordml/cid" xmlns:w16="http://schemas.microsoft.com/office/word/2018/wordml" xmlns:w16du="http://schemas.microsoft.com/office/word/2023/wordml/word16du" xmlns:w16sdtdh="http://schemas.microsoft.com/office/word/2020/wordml/sdtdatahash" xmlns:w16sdtfl="http://schemas.microsoft.com/office/word/2024/wordml/sdtformatlock" xmlns:w16se="http://schemas.microsoft.com/office/word/2015/wordml/symex" xmlns:wpg="http://schemas.microsoft.com/office/word/2010/wordprocessingGroup" xmlns:wpi="http://schemas.microsoft.com/office/word/2010/wordprocessingInk" xmlns:wne="http://schemas.microsoft.com/office/word/2006/wordml" xmlns:wps="http://schemas.microsoft.com/office/word/2010/wordprocessingShape" mc:Ignorable="w14 w15 w16se w16cid w16 w16cex w16sdtdh w16sdtfl w16du wp14">
   <w:p>
     <w:pPr>
       <w:pStyle w:val="Footer"/>
@@ -1388,7 +1369,7 @@
 </file>
 
 <file path=word/footer2.xml><?xml version="1.0" encoding="utf-8"?>
-<w:ftr xmlns:wpc="http://schemas.microsoft.com/office/word/2010/wordprocessingCanvas" xmlns:cx="http://schemas.microsoft.com/office/drawing/2014/chartex" xmlns:cx1="http://schemas.microsoft.com/office/drawing/2015/9/8/chartex" xmlns:cx2="http://schemas.microsoft.com/office/drawing/2015/10/21/chartex" xmlns:cx3="http://schemas.microsoft.com/office/drawing/2016/5/9/chartex" xmlns:cx4="http://schemas.microsoft.com/office/drawing/2016/5/10/chartex" xmlns:cx5="http://schemas.microsoft.com/office/drawing/2016/5/11/chartex" xmlns:cx6="http://schemas.microsoft.com/office/drawing/2016/5/12/chartex" xmlns:cx7="http://schemas.microsoft.com/office/drawing/2016/5/13/chartex" xmlns:cx8="http://schemas.microsoft.com/office/drawing/2016/5/14/chartex" xmlns:mc="http://schemas.openxmlformats.org/markup-compatibility/2006" xmlns:aink="http://schemas.microsoft.com/office/drawing/2016/ink" xmlns:am3d="http://schemas.microsoft.com/office/drawing/2017/model3d" xmlns:o="urn:schemas-microsoft-com:office:office" xmlns:oel="http://schemas.microsoft.com/office/2019/extlst" xmlns:r="http://schemas.openxmlformats.org/officeDocument/2006/relationships" xmlns:m="http://schemas.openxmlformats.org/officeDocument/2006/math" xmlns:v="urn:schemas-microsoft-com:vml" xmlns:wp14="http://schemas.microsoft.com/office/word/2010/wordprocessingDrawing" xmlns:wp="http://schemas.openxmlformats.org/drawingml/2006/wordprocessingDrawing" xmlns:w10="urn:schemas-microsoft-com:office:word" xmlns:w="http://schemas.openxmlformats.org/wordprocessingml/2006/main" xmlns:w14="http://schemas.microsoft.com/office/word/2010/wordml" xmlns:w15="http://schemas.microsoft.com/office/word/2012/wordml" xmlns:w16cex="http://schemas.microsoft.com/office/word/2018/wordml/cex" xmlns:w16cid="http://schemas.microsoft.com/office/word/2016/wordml/cid" xmlns:w16="http://schemas.microsoft.com/office/word/2018/wordml" xmlns:w16sdtdh="http://schemas.microsoft.com/office/word/2020/wordml/sdtdatahash" xmlns:w16se="http://schemas.microsoft.com/office/word/2015/wordml/symex" xmlns:wpg="http://schemas.microsoft.com/office/word/2010/wordprocessingGroup" xmlns:wpi="http://schemas.microsoft.com/office/word/2010/wordprocessingInk" xmlns:wne="http://schemas.microsoft.com/office/word/2006/wordml" xmlns:wps="http://schemas.microsoft.com/office/word/2010/wordprocessingShape" mc:Ignorable="w14 w15 w16se w16cid w16 w16cex w16sdtdh wp14">
+<w:ftr xmlns:wpc="http://schemas.microsoft.com/office/word/2010/wordprocessingCanvas" xmlns:cx="http://schemas.microsoft.com/office/drawing/2014/chartex" xmlns:cx1="http://schemas.microsoft.com/office/drawing/2015/9/8/chartex" xmlns:cx2="http://schemas.microsoft.com/office/drawing/2015/10/21/chartex" xmlns:cx3="http://schemas.microsoft.com/office/drawing/2016/5/9/chartex" xmlns:cx4="http://schemas.microsoft.com/office/drawing/2016/5/10/chartex" xmlns:cx5="http://schemas.microsoft.com/office/drawing/2016/5/11/chartex" xmlns:cx6="http://schemas.microsoft.com/office/drawing/2016/5/12/chartex" xmlns:cx7="http://schemas.microsoft.com/office/drawing/2016/5/13/chartex" xmlns:cx8="http://schemas.microsoft.com/office/drawing/2016/5/14/chartex" xmlns:mc="http://schemas.openxmlformats.org/markup-compatibility/2006" xmlns:aink="http://schemas.microsoft.com/office/drawing/2016/ink" xmlns:am3d="http://schemas.microsoft.com/office/drawing/2017/model3d" xmlns:o="urn:schemas-microsoft-com:office:office" xmlns:oel="http://schemas.microsoft.com/office/2019/extlst" xmlns:r="http://schemas.openxmlformats.org/officeDocument/2006/relationships" xmlns:m="http://schemas.openxmlformats.org/officeDocument/2006/math" xmlns:v="urn:schemas-microsoft-com:vml" xmlns:wp14="http://schemas.microsoft.com/office/word/2010/wordprocessingDrawing" xmlns:wp="http://schemas.openxmlformats.org/drawingml/2006/wordprocessingDrawing" xmlns:w10="urn:schemas-microsoft-com:office:word" xmlns:w="http://schemas.openxmlformats.org/wordprocessingml/2006/main" xmlns:w14="http://schemas.microsoft.com/office/word/2010/wordml" xmlns:w15="http://schemas.microsoft.com/office/word/2012/wordml" xmlns:w16cex="http://schemas.microsoft.com/office/word/2018/wordml/cex" xmlns:w16cid="http://schemas.microsoft.com/office/word/2016/wordml/cid" xmlns:w16="http://schemas.microsoft.com/office/word/2018/wordml" xmlns:w16du="http://schemas.microsoft.com/office/word/2023/wordml/word16du" xmlns:w16sdtdh="http://schemas.microsoft.com/office/word/2020/wordml/sdtdatahash" xmlns:w16sdtfl="http://schemas.microsoft.com/office/word/2024/wordml/sdtformatlock" xmlns:w16se="http://schemas.microsoft.com/office/word/2015/wordml/symex" xmlns:wpg="http://schemas.microsoft.com/office/word/2010/wordprocessingGroup" xmlns:wpi="http://schemas.microsoft.com/office/word/2010/wordprocessingInk" xmlns:wne="http://schemas.microsoft.com/office/word/2006/wordml" xmlns:wps="http://schemas.microsoft.com/office/word/2010/wordprocessingShape" mc:Ignorable="w14 w15 w16se w16cid w16 w16cex w16sdtdh w16sdtfl w16du wp14">
   <w:p>
     <w:pPr>
       <w:pStyle w:val="Footer"/>
@@ -1398,7 +1379,7 @@
 </file>
 
 <file path=word/footer3.xml><?xml version="1.0" encoding="utf-8"?>
-<w:ftr xmlns:wpc="http://schemas.microsoft.com/office/word/2010/wordprocessingCanvas" xmlns:cx="http://schemas.microsoft.com/office/drawing/2014/chartex" xmlns:cx1="http://schemas.microsoft.com/office/drawing/2015/9/8/chartex" xmlns:cx2="http://schemas.microsoft.com/office/drawing/2015/10/21/chartex" xmlns:cx3="http://schemas.microsoft.com/office/drawing/2016/5/9/chartex" xmlns:cx4="http://schemas.microsoft.com/office/drawing/2016/5/10/chartex" xmlns:cx5="http://schemas.microsoft.com/office/drawing/2016/5/11/chartex" xmlns:cx6="http://schemas.microsoft.com/office/drawing/2016/5/12/chartex" xmlns:cx7="http://schemas.microsoft.com/office/drawing/2016/5/13/chartex" xmlns:cx8="http://schemas.microsoft.com/office/drawing/2016/5/14/chartex" xmlns:mc="http://schemas.openxmlformats.org/markup-compatibility/2006" xmlns:aink="http://schemas.microsoft.com/office/drawing/2016/ink" xmlns:am3d="http://schemas.microsoft.com/office/drawing/2017/model3d" xmlns:o="urn:schemas-microsoft-com:office:office" xmlns:oel="http://schemas.microsoft.com/office/2019/extlst" xmlns:r="http://schemas.openxmlformats.org/officeDocument/2006/relationships" xmlns:m="http://schemas.openxmlformats.org/officeDocument/2006/math" xmlns:v="urn:schemas-microsoft-com:vml" xmlns:wp14="http://schemas.microsoft.com/office/word/2010/wordprocessingDrawing" xmlns:wp="http://schemas.openxmlformats.org/drawingml/2006/wordprocessingDrawing" xmlns:w10="urn:schemas-microsoft-com:office:word" xmlns:w="http://schemas.openxmlformats.org/wordprocessingml/2006/main" xmlns:w14="http://schemas.microsoft.com/office/word/2010/wordml" xmlns:w15="http://schemas.microsoft.com/office/word/2012/wordml" xmlns:w16cex="http://schemas.microsoft.com/office/word/2018/wordml/cex" xmlns:w16cid="http://schemas.microsoft.com/office/word/2016/wordml/cid" xmlns:w16="http://schemas.microsoft.com/office/word/2018/wordml" xmlns:w16sdtdh="http://schemas.microsoft.com/office/word/2020/wordml/sdtdatahash" xmlns:w16se="http://schemas.microsoft.com/office/word/2015/wordml/symex" xmlns:wpg="http://schemas.microsoft.com/office/word/2010/wordprocessingGroup" xmlns:wpi="http://schemas.microsoft.com/office/word/2010/wordprocessingInk" xmlns:wne="http://schemas.microsoft.com/office/word/2006/wordml" xmlns:wps="http://schemas.microsoft.com/office/word/2010/wordprocessingShape" mc:Ignorable="w14 w15 w16se w16cid w16 w16cex w16sdtdh wp14">
+<w:ftr xmlns:wpc="http://schemas.microsoft.com/office/word/2010/wordprocessingCanvas" xmlns:cx="http://schemas.microsoft.com/office/drawing/2014/chartex" xmlns:cx1="http://schemas.microsoft.com/office/drawing/2015/9/8/chartex" xmlns:cx2="http://schemas.microsoft.com/office/drawing/2015/10/21/chartex" xmlns:cx3="http://schemas.microsoft.com/office/drawing/2016/5/9/chartex" xmlns:cx4="http://schemas.microsoft.com/office/drawing/2016/5/10/chartex" xmlns:cx5="http://schemas.microsoft.com/office/drawing/2016/5/11/chartex" xmlns:cx6="http://schemas.microsoft.com/office/drawing/2016/5/12/chartex" xmlns:cx7="http://schemas.microsoft.com/office/drawing/2016/5/13/chartex" xmlns:cx8="http://schemas.microsoft.com/office/drawing/2016/5/14/chartex" xmlns:mc="http://schemas.openxmlformats.org/markup-compatibility/2006" xmlns:aink="http://schemas.microsoft.com/office/drawing/2016/ink" xmlns:am3d="http://schemas.microsoft.com/office/drawing/2017/model3d" xmlns:o="urn:schemas-microsoft-com:office:office" xmlns:oel="http://schemas.microsoft.com/office/2019/extlst" xmlns:r="http://schemas.openxmlformats.org/officeDocument/2006/relationships" xmlns:m="http://schemas.openxmlformats.org/officeDocument/2006/math" xmlns:v="urn:schemas-microsoft-com:vml" xmlns:wp14="http://schemas.microsoft.com/office/word/2010/wordprocessingDrawing" xmlns:wp="http://schemas.openxmlformats.org/drawingml/2006/wordprocessingDrawing" xmlns:w10="urn:schemas-microsoft-com:office:word" xmlns:w="http://schemas.openxmlformats.org/wordprocessingml/2006/main" xmlns:w14="http://schemas.microsoft.com/office/word/2010/wordml" xmlns:w15="http://schemas.microsoft.com/office/word/2012/wordml" xmlns:w16cex="http://schemas.microsoft.com/office/word/2018/wordml/cex" xmlns:w16cid="http://schemas.microsoft.com/office/word/2016/wordml/cid" xmlns:w16="http://schemas.microsoft.com/office/word/2018/wordml" xmlns:w16du="http://schemas.microsoft.com/office/word/2023/wordml/word16du" xmlns:w16sdtdh="http://schemas.microsoft.com/office/word/2020/wordml/sdtdatahash" xmlns:w16sdtfl="http://schemas.microsoft.com/office/word/2024/wordml/sdtformatlock" xmlns:w16se="http://schemas.microsoft.com/office/word/2015/wordml/symex" xmlns:wpg="http://schemas.microsoft.com/office/word/2010/wordprocessingGroup" xmlns:wpi="http://schemas.microsoft.com/office/word/2010/wordprocessingInk" xmlns:wne="http://schemas.microsoft.com/office/word/2006/wordml" xmlns:wps="http://schemas.microsoft.com/office/word/2010/wordprocessingShape" mc:Ignorable="w14 w15 w16se w16cid w16 w16cex w16sdtdh w16sdtfl w16du wp14">
   <w:p>
     <w:pPr>
       <w:pStyle w:val="Footer"/>
@@ -1408,7 +1389,7 @@
 </file>
 
 <file path=word/footnotes.xml><?xml version="1.0" encoding="utf-8"?>
-<w:footnotes xmlns:wpc="http://schemas.microsoft.com/office/word/2010/wordprocessingCanvas" xmlns:cx="http://schemas.microsoft.com/office/drawing/2014/chartex" xmlns:cx1="http://schemas.microsoft.com/office/drawing/2015/9/8/chartex" xmlns:cx2="http://schemas.microsoft.com/office/drawing/2015/10/21/chartex" xmlns:cx3="http://schemas.microsoft.com/office/drawing/2016/5/9/chartex" xmlns:cx4="http://schemas.microsoft.com/office/drawing/2016/5/10/chartex" xmlns:cx5="http://schemas.microsoft.com/office/drawing/2016/5/11/chartex" xmlns:cx6="http://schemas.microsoft.com/office/drawing/2016/5/12/chartex" xmlns:cx7="http://schemas.microsoft.com/office/drawing/2016/5/13/chartex" xmlns:cx8="http://schemas.microsoft.com/office/drawing/2016/5/14/chartex" xmlns:mc="http://schemas.openxmlformats.org/markup-compatibility/2006" xmlns:aink="http://schemas.microsoft.com/office/drawing/2016/ink" xmlns:am3d="http://schemas.microsoft.com/office/drawing/2017/model3d" xmlns:o="urn:schemas-microsoft-com:office:office" xmlns:oel="http://schemas.microsoft.com/office/2019/extlst" xmlns:r="http://schemas.openxmlformats.org/officeDocument/2006/relationships" xmlns:m="http://schemas.openxmlformats.org/officeDocument/2006/math" xmlns:v="urn:schemas-microsoft-com:vml" xmlns:wp14="http://schemas.microsoft.com/office/word/2010/wordprocessingDrawing" xmlns:wp="http://schemas.openxmlformats.org/drawingml/2006/wordprocessingDrawing" xmlns:w10="urn:schemas-microsoft-com:office:word" xmlns:w="http://schemas.openxmlformats.org/wordprocessingml/2006/main" xmlns:w14="http://schemas.microsoft.com/office/word/2010/wordml" xmlns:w15="http://schemas.microsoft.com/office/word/2012/wordml" xmlns:w16cex="http://schemas.microsoft.com/office/word/2018/wordml/cex" xmlns:w16cid="http://schemas.microsoft.com/office/word/2016/wordml/cid" xmlns:w16="http://schemas.microsoft.com/office/word/2018/wordml" xmlns:w16sdtdh="http://schemas.microsoft.com/office/word/2020/wordml/sdtdatahash" xmlns:w16se="http://schemas.microsoft.com/office/word/2015/wordml/symex" xmlns:wpg="http://schemas.microsoft.com/office/word/2010/wordprocessingGroup" xmlns:wpi="http://schemas.microsoft.com/office/word/2010/wordprocessingInk" xmlns:wne="http://schemas.microsoft.com/office/word/2006/wordml" xmlns:wps="http://schemas.microsoft.com/office/word/2010/wordprocessingShape" mc:Ignorable="w14 w15 w16se w16cid w16 w16cex w16sdtdh wp14">
+<w:footnotes xmlns:wpc="http://schemas.microsoft.com/office/word/2010/wordprocessingCanvas" xmlns:cx="http://schemas.microsoft.com/office/drawing/2014/chartex" xmlns:cx1="http://schemas.microsoft.com/office/drawing/2015/9/8/chartex" xmlns:cx2="http://schemas.microsoft.com/office/drawing/2015/10/21/chartex" xmlns:cx3="http://schemas.microsoft.com/office/drawing/2016/5/9/chartex" xmlns:cx4="http://schemas.microsoft.com/office/drawing/2016/5/10/chartex" xmlns:cx5="http://schemas.microsoft.com/office/drawing/2016/5/11/chartex" xmlns:cx6="http://schemas.microsoft.com/office/drawing/2016/5/12/chartex" xmlns:cx7="http://schemas.microsoft.com/office/drawing/2016/5/13/chartex" xmlns:cx8="http://schemas.microsoft.com/office/drawing/2016/5/14/chartex" xmlns:mc="http://schemas.openxmlformats.org/markup-compatibility/2006" xmlns:aink="http://schemas.microsoft.com/office/drawing/2016/ink" xmlns:am3d="http://schemas.microsoft.com/office/drawing/2017/model3d" xmlns:o="urn:schemas-microsoft-com:office:office" xmlns:oel="http://schemas.microsoft.com/office/2019/extlst" xmlns:r="http://schemas.openxmlformats.org/officeDocument/2006/relationships" xmlns:m="http://schemas.openxmlformats.org/officeDocument/2006/math" xmlns:v="urn:schemas-microsoft-com:vml" xmlns:wp14="http://schemas.microsoft.com/office/word/2010/wordprocessingDrawing" xmlns:wp="http://schemas.openxmlformats.org/drawingml/2006/wordprocessingDrawing" xmlns:w10="urn:schemas-microsoft-com:office:word" xmlns:w="http://schemas.openxmlformats.org/wordprocessingml/2006/main" xmlns:w14="http://schemas.microsoft.com/office/word/2010/wordml" xmlns:w15="http://schemas.microsoft.com/office/word/2012/wordml" xmlns:w16cex="http://schemas.microsoft.com/office/word/2018/wordml/cex" xmlns:w16cid="http://schemas.microsoft.com/office/word/2016/wordml/cid" xmlns:w16="http://schemas.microsoft.com/office/word/2018/wordml" xmlns:w16du="http://schemas.microsoft.com/office/word/2023/wordml/word16du" xmlns:w16sdtdh="http://schemas.microsoft.com/office/word/2020/wordml/sdtdatahash" xmlns:w16sdtfl="http://schemas.microsoft.com/office/word/2024/wordml/sdtformatlock" xmlns:w16se="http://schemas.microsoft.com/office/word/2015/wordml/symex" xmlns:wpg="http://schemas.microsoft.com/office/word/2010/wordprocessingGroup" xmlns:wpi="http://schemas.microsoft.com/office/word/2010/wordprocessingInk" xmlns:wne="http://schemas.microsoft.com/office/word/2006/wordml" xmlns:wps="http://schemas.microsoft.com/office/word/2010/wordprocessingShape" mc:Ignorable="w14 w15 w16se w16cid w16 w16cex w16sdtdh w16sdtfl w16du wp14">
   <w:footnote w:type="separator" w:id="-1">
     <w:p>
       <w:pPr>
@@ -1433,7 +1414,7 @@
 </file>
 
 <file path=word/header1.xml><?xml version="1.0" encoding="utf-8"?>
-<w:hdr xmlns:wpc="http://schemas.microsoft.com/office/word/2010/wordprocessingCanvas" xmlns:cx="http://schemas.microsoft.com/office/drawing/2014/chartex" xmlns:cx1="http://schemas.microsoft.com/office/drawing/2015/9/8/chartex" xmlns:cx2="http://schemas.microsoft.com/office/drawing/2015/10/21/chartex" xmlns:cx3="http://schemas.microsoft.com/office/drawing/2016/5/9/chartex" xmlns:cx4="http://schemas.microsoft.com/office/drawing/2016/5/10/chartex" xmlns:cx5="http://schemas.microsoft.com/office/drawing/2016/5/11/chartex" xmlns:cx6="http://schemas.microsoft.com/office/drawing/2016/5/12/chartex" xmlns:cx7="http://schemas.microsoft.com/office/drawing/2016/5/13/chartex" xmlns:cx8="http://schemas.microsoft.com/office/drawing/2016/5/14/chartex" xmlns:mc="http://schemas.openxmlformats.org/markup-compatibility/2006" xmlns:aink="http://schemas.microsoft.com/office/drawing/2016/ink" xmlns:am3d="http://schemas.microsoft.com/office/drawing/2017/model3d" xmlns:o="urn:schemas-microsoft-com:office:office" xmlns:oel="http://schemas.microsoft.com/office/2019/extlst" xmlns:r="http://schemas.openxmlformats.org/officeDocument/2006/relationships" xmlns:m="http://schemas.openxmlformats.org/officeDocument/2006/math" xmlns:v="urn:schemas-microsoft-com:vml" xmlns:wp14="http://schemas.microsoft.com/office/word/2010/wordprocessingDrawing" xmlns:wp="http://schemas.openxmlformats.org/drawingml/2006/wordprocessingDrawing" xmlns:w10="urn:schemas-microsoft-com:office:word" xmlns:w="http://schemas.openxmlformats.org/wordprocessingml/2006/main" xmlns:w14="http://schemas.microsoft.com/office/word/2010/wordml" xmlns:w15="http://schemas.microsoft.com/office/word/2012/wordml" xmlns:w16cex="http://schemas.microsoft.com/office/word/2018/wordml/cex" xmlns:w16cid="http://schemas.microsoft.com/office/word/2016/wordml/cid" xmlns:w16="http://schemas.microsoft.com/office/word/2018/wordml" xmlns:w16sdtdh="http://schemas.microsoft.com/office/word/2020/wordml/sdtdatahash" xmlns:w16se="http://schemas.microsoft.com/office/word/2015/wordml/symex" xmlns:wpg="http://schemas.microsoft.com/office/word/2010/wordprocessingGroup" xmlns:wpi="http://schemas.microsoft.com/office/word/2010/wordprocessingInk" xmlns:wne="http://schemas.microsoft.com/office/word/2006/wordml" xmlns:wps="http://schemas.microsoft.com/office/word/2010/wordprocessingShape" mc:Ignorable="w14 w15 w16se w16cid w16 w16cex w16sdtdh wp14">
+<w:hdr xmlns:wpc="http://schemas.microsoft.com/office/word/2010/wordprocessingCanvas" xmlns:cx="http://schemas.microsoft.com/office/drawing/2014/chartex" xmlns:cx1="http://schemas.microsoft.com/office/drawing/2015/9/8/chartex" xmlns:cx2="http://schemas.microsoft.com/office/drawing/2015/10/21/chartex" xmlns:cx3="http://schemas.microsoft.com/office/drawing/2016/5/9/chartex" xmlns:cx4="http://schemas.microsoft.com/office/drawing/2016/5/10/chartex" xmlns:cx5="http://schemas.microsoft.com/office/drawing/2016/5/11/chartex" xmlns:cx6="http://schemas.microsoft.com/office/drawing/2016/5/12/chartex" xmlns:cx7="http://schemas.microsoft.com/office/drawing/2016/5/13/chartex" xmlns:cx8="http://schemas.microsoft.com/office/drawing/2016/5/14/chartex" xmlns:mc="http://schemas.openxmlformats.org/markup-compatibility/2006" xmlns:aink="http://schemas.microsoft.com/office/drawing/2016/ink" xmlns:am3d="http://schemas.microsoft.com/office/drawing/2017/model3d" xmlns:o="urn:schemas-microsoft-com:office:office" xmlns:oel="http://schemas.microsoft.com/office/2019/extlst" xmlns:r="http://schemas.openxmlformats.org/officeDocument/2006/relationships" xmlns:m="http://schemas.openxmlformats.org/officeDocument/2006/math" xmlns:v="urn:schemas-microsoft-com:vml" xmlns:wp14="http://schemas.microsoft.com/office/word/2010/wordprocessingDrawing" xmlns:wp="http://schemas.openxmlformats.org/drawingml/2006/wordprocessingDrawing" xmlns:w10="urn:schemas-microsoft-com:office:word" xmlns:w="http://schemas.openxmlformats.org/wordprocessingml/2006/main" xmlns:w14="http://schemas.microsoft.com/office/word/2010/wordml" xmlns:w15="http://schemas.microsoft.com/office/word/2012/wordml" xmlns:w16cex="http://schemas.microsoft.com/office/word/2018/wordml/cex" xmlns:w16cid="http://schemas.microsoft.com/office/word/2016/wordml/cid" xmlns:w16="http://schemas.microsoft.com/office/word/2018/wordml" xmlns:w16du="http://schemas.microsoft.com/office/word/2023/wordml/word16du" xmlns:w16sdtdh="http://schemas.microsoft.com/office/word/2020/wordml/sdtdatahash" xmlns:w16sdtfl="http://schemas.microsoft.com/office/word/2024/wordml/sdtformatlock" xmlns:w16se="http://schemas.microsoft.com/office/word/2015/wordml/symex" xmlns:wpg="http://schemas.microsoft.com/office/word/2010/wordprocessingGroup" xmlns:wpi="http://schemas.microsoft.com/office/word/2010/wordprocessingInk" xmlns:wne="http://schemas.microsoft.com/office/word/2006/wordml" xmlns:wps="http://schemas.microsoft.com/office/word/2010/wordprocessingShape" mc:Ignorable="w14 w15 w16se w16cid w16 w16cex w16sdtdh w16sdtfl w16du wp14">
   <w:p>
     <w:pPr>
       <w:pStyle w:val="Header"/>
@@ -1443,7 +1424,7 @@
 </file>
 
 <file path=word/header2.xml><?xml version="1.0" encoding="utf-8"?>
-<w:hdr xmlns:wpc="http://schemas.microsoft.com/office/word/2010/wordprocessingCanvas" xmlns:cx="http://schemas.microsoft.com/office/drawing/2014/chartex" xmlns:cx1="http://schemas.microsoft.com/office/drawing/2015/9/8/chartex" xmlns:cx2="http://schemas.microsoft.com/office/drawing/2015/10/21/chartex" xmlns:cx3="http://schemas.microsoft.com/office/drawing/2016/5/9/chartex" xmlns:cx4="http://schemas.microsoft.com/office/drawing/2016/5/10/chartex" xmlns:cx5="http://schemas.microsoft.com/office/drawing/2016/5/11/chartex" xmlns:cx6="http://schemas.microsoft.com/office/drawing/2016/5/12/chartex" xmlns:cx7="http://schemas.microsoft.com/office/drawing/2016/5/13/chartex" xmlns:cx8="http://schemas.microsoft.com/office/drawing/2016/5/14/chartex" xmlns:mc="http://schemas.openxmlformats.org/markup-compatibility/2006" xmlns:aink="http://schemas.microsoft.com/office/drawing/2016/ink" xmlns:am3d="http://schemas.microsoft.com/office/drawing/2017/model3d" xmlns:o="urn:schemas-microsoft-com:office:office" xmlns:oel="http://schemas.microsoft.com/office/2019/extlst" xmlns:r="http://schemas.openxmlformats.org/officeDocument/2006/relationships" xmlns:m="http://schemas.openxmlformats.org/officeDocument/2006/math" xmlns:v="urn:schemas-microsoft-com:vml" xmlns:wp14="http://schemas.microsoft.com/office/word/2010/wordprocessingDrawing" xmlns:wp="http://schemas.openxmlformats.org/drawingml/2006/wordprocessingDrawing" xmlns:w10="urn:schemas-microsoft-com:office:word" xmlns:w="http://schemas.openxmlformats.org/wordprocessingml/2006/main" xmlns:w14="http://schemas.microsoft.com/office/word/2010/wordml" xmlns:w15="http://schemas.microsoft.com/office/word/2012/wordml" xmlns:w16cex="http://schemas.microsoft.com/office/word/2018/wordml/cex" xmlns:w16cid="http://schemas.microsoft.com/office/word/2016/wordml/cid" xmlns:w16="http://schemas.microsoft.com/office/word/2018/wordml" xmlns:w16sdtdh="http://schemas.microsoft.com/office/word/2020/wordml/sdtdatahash" xmlns:w16se="http://schemas.microsoft.com/office/word/2015/wordml/symex" xmlns:wpg="http://schemas.microsoft.com/office/word/2010/wordprocessingGroup" xmlns:wpi="http://schemas.microsoft.com/office/word/2010/wordprocessingInk" xmlns:wne="http://schemas.microsoft.com/office/word/2006/wordml" xmlns:wps="http://schemas.microsoft.com/office/word/2010/wordprocessingShape" mc:Ignorable="w14 w15 w16se w16cid w16 w16cex w16sdtdh wp14">
+<w:hdr xmlns:wpc="http://schemas.microsoft.com/office/word/2010/wordprocessingCanvas" xmlns:cx="http://schemas.microsoft.com/office/drawing/2014/chartex" xmlns:cx1="http://schemas.microsoft.com/office/drawing/2015/9/8/chartex" xmlns:cx2="http://schemas.microsoft.com/office/drawing/2015/10/21/chartex" xmlns:cx3="http://schemas.microsoft.com/office/drawing/2016/5/9/chartex" xmlns:cx4="http://schemas.microsoft.com/office/drawing/2016/5/10/chartex" xmlns:cx5="http://schemas.microsoft.com/office/drawing/2016/5/11/chartex" xmlns:cx6="http://schemas.microsoft.com/office/drawing/2016/5/12/chartex" xmlns:cx7="http://schemas.microsoft.com/office/drawing/2016/5/13/chartex" xmlns:cx8="http://schemas.microsoft.com/office/drawing/2016/5/14/chartex" xmlns:mc="http://schemas.openxmlformats.org/markup-compatibility/2006" xmlns:aink="http://schemas.microsoft.com/office/drawing/2016/ink" xmlns:am3d="http://schemas.microsoft.com/office/drawing/2017/model3d" xmlns:o="urn:schemas-microsoft-com:office:office" xmlns:oel="http://schemas.microsoft.com/office/2019/extlst" xmlns:r="http://schemas.openxmlformats.org/officeDocument/2006/relationships" xmlns:m="http://schemas.openxmlformats.org/officeDocument/2006/math" xmlns:v="urn:schemas-microsoft-com:vml" xmlns:wp14="http://schemas.microsoft.com/office/word/2010/wordprocessingDrawing" xmlns:wp="http://schemas.openxmlformats.org/drawingml/2006/wordprocessingDrawing" xmlns:w10="urn:schemas-microsoft-com:office:word" xmlns:w="http://schemas.openxmlformats.org/wordprocessingml/2006/main" xmlns:w14="http://schemas.microsoft.com/office/word/2010/wordml" xmlns:w15="http://schemas.microsoft.com/office/word/2012/wordml" xmlns:w16cex="http://schemas.microsoft.com/office/word/2018/wordml/cex" xmlns:w16cid="http://schemas.microsoft.com/office/word/2016/wordml/cid" xmlns:w16="http://schemas.microsoft.com/office/word/2018/wordml" xmlns:w16du="http://schemas.microsoft.com/office/word/2023/wordml/word16du" xmlns:w16sdtdh="http://schemas.microsoft.com/office/word/2020/wordml/sdtdatahash" xmlns:w16sdtfl="http://schemas.microsoft.com/office/word/2024/wordml/sdtformatlock" xmlns:w16se="http://schemas.microsoft.com/office/word/2015/wordml/symex" xmlns:wpg="http://schemas.microsoft.com/office/word/2010/wordprocessingGroup" xmlns:wpi="http://schemas.microsoft.com/office/word/2010/wordprocessingInk" xmlns:wne="http://schemas.microsoft.com/office/word/2006/wordml" xmlns:wps="http://schemas.microsoft.com/office/word/2010/wordprocessingShape" mc:Ignorable="w14 w15 w16se w16cid w16 w16cex w16sdtdh w16sdtfl w16du wp14">
   <w:p>
     <w:pPr>
       <w:pStyle w:val="Header"/>
@@ -1466,7 +1447,7 @@
 </file>
 
 <file path=word/header3.xml><?xml version="1.0" encoding="utf-8"?>
-<w:hdr xmlns:wpc="http://schemas.microsoft.com/office/word/2010/wordprocessingCanvas" xmlns:cx="http://schemas.microsoft.com/office/drawing/2014/chartex" xmlns:cx1="http://schemas.microsoft.com/office/drawing/2015/9/8/chartex" xmlns:cx2="http://schemas.microsoft.com/office/drawing/2015/10/21/chartex" xmlns:cx3="http://schemas.microsoft.com/office/drawing/2016/5/9/chartex" xmlns:cx4="http://schemas.microsoft.com/office/drawing/2016/5/10/chartex" xmlns:cx5="http://schemas.microsoft.com/office/drawing/2016/5/11/chartex" xmlns:cx6="http://schemas.microsoft.com/office/drawing/2016/5/12/chartex" xmlns:cx7="http://schemas.microsoft.com/office/drawing/2016/5/13/chartex" xmlns:cx8="http://schemas.microsoft.com/office/drawing/2016/5/14/chartex" xmlns:mc="http://schemas.openxmlformats.org/markup-compatibility/2006" xmlns:aink="http://schemas.microsoft.com/office/drawing/2016/ink" xmlns:am3d="http://schemas.microsoft.com/office/drawing/2017/model3d" xmlns:o="urn:schemas-microsoft-com:office:office" xmlns:oel="http://schemas.microsoft.com/office/2019/extlst" xmlns:r="http://schemas.openxmlformats.org/officeDocument/2006/relationships" xmlns:m="http://schemas.openxmlformats.org/officeDocument/2006/math" xmlns:v="urn:schemas-microsoft-com:vml" xmlns:wp14="http://schemas.microsoft.com/office/word/2010/wordprocessingDrawing" xmlns:wp="http://schemas.openxmlformats.org/drawingml/2006/wordprocessingDrawing" xmlns:w10="urn:schemas-microsoft-com:office:word" xmlns:w="http://schemas.openxmlformats.org/wordprocessingml/2006/main" xmlns:w14="http://schemas.microsoft.com/office/word/2010/wordml" xmlns:w15="http://schemas.microsoft.com/office/word/2012/wordml" xmlns:w16cex="http://schemas.microsoft.com/office/word/2018/wordml/cex" xmlns:w16cid="http://schemas.microsoft.com/office/word/2016/wordml/cid" xmlns:w16="http://schemas.microsoft.com/office/word/2018/wordml" xmlns:w16sdtdh="http://schemas.microsoft.com/office/word/2020/wordml/sdtdatahash" xmlns:w16se="http://schemas.microsoft.com/office/word/2015/wordml/symex" xmlns:wpg="http://schemas.microsoft.com/office/word/2010/wordprocessingGroup" xmlns:wpi="http://schemas.microsoft.com/office/word/2010/wordprocessingInk" xmlns:wne="http://schemas.microsoft.com/office/word/2006/wordml" xmlns:wps="http://schemas.microsoft.com/office/word/2010/wordprocessingShape" mc:Ignorable="w14 w15 w16se w16cid w16 w16cex w16sdtdh wp14">
+<w:hdr xmlns:wpc="http://schemas.microsoft.com/office/word/2010/wordprocessingCanvas" xmlns:cx="http://schemas.microsoft.com/office/drawing/2014/chartex" xmlns:cx1="http://schemas.microsoft.com/office/drawing/2015/9/8/chartex" xmlns:cx2="http://schemas.microsoft.com/office/drawing/2015/10/21/chartex" xmlns:cx3="http://schemas.microsoft.com/office/drawing/2016/5/9/chartex" xmlns:cx4="http://schemas.microsoft.com/office/drawing/2016/5/10/chartex" xmlns:cx5="http://schemas.microsoft.com/office/drawing/2016/5/11/chartex" xmlns:cx6="http://schemas.microsoft.com/office/drawing/2016/5/12/chartex" xmlns:cx7="http://schemas.microsoft.com/office/drawing/2016/5/13/chartex" xmlns:cx8="http://schemas.microsoft.com/office/drawing/2016/5/14/chartex" xmlns:mc="http://schemas.openxmlformats.org/markup-compatibility/2006" xmlns:aink="http://schemas.microsoft.com/office/drawing/2016/ink" xmlns:am3d="http://schemas.microsoft.com/office/drawing/2017/model3d" xmlns:o="urn:schemas-microsoft-com:office:office" xmlns:oel="http://schemas.microsoft.com/office/2019/extlst" xmlns:r="http://schemas.openxmlformats.org/officeDocument/2006/relationships" xmlns:m="http://schemas.openxmlformats.org/officeDocument/2006/math" xmlns:v="urn:schemas-microsoft-com:vml" xmlns:wp14="http://schemas.microsoft.com/office/word/2010/wordprocessingDrawing" xmlns:wp="http://schemas.openxmlformats.org/drawingml/2006/wordprocessingDrawing" xmlns:w10="urn:schemas-microsoft-com:office:word" xmlns:w="http://schemas.openxmlformats.org/wordprocessingml/2006/main" xmlns:w14="http://schemas.microsoft.com/office/word/2010/wordml" xmlns:w15="http://schemas.microsoft.com/office/word/2012/wordml" xmlns:w16cex="http://schemas.microsoft.com/office/word/2018/wordml/cex" xmlns:w16cid="http://schemas.microsoft.com/office/word/2016/wordml/cid" xmlns:w16="http://schemas.microsoft.com/office/word/2018/wordml" xmlns:w16du="http://schemas.microsoft.com/office/word/2023/wordml/word16du" xmlns:w16sdtdh="http://schemas.microsoft.com/office/word/2020/wordml/sdtdatahash" xmlns:w16sdtfl="http://schemas.microsoft.com/office/word/2024/wordml/sdtformatlock" xmlns:w16se="http://schemas.microsoft.com/office/word/2015/wordml/symex" xmlns:wpg="http://schemas.microsoft.com/office/word/2010/wordprocessingGroup" xmlns:wpi="http://schemas.microsoft.com/office/word/2010/wordprocessingInk" xmlns:wne="http://schemas.microsoft.com/office/word/2006/wordml" xmlns:wps="http://schemas.microsoft.com/office/word/2010/wordprocessingShape" mc:Ignorable="w14 w15 w16se w16cid w16 w16cex w16sdtdh w16sdtfl w16du wp14">
   <w:p>
     <w:pPr>
       <w:pStyle w:val="Header"/>
@@ -1476,7 +1457,7 @@
 </file>
 
 <file path=word/numbering.xml><?xml version="1.0" encoding="utf-8"?>
-<w:numbering xmlns:wpc="http://schemas.microsoft.com/office/word/2010/wordprocessingCanvas" xmlns:cx="http://schemas.microsoft.com/office/drawing/2014/chartex" xmlns:cx1="http://schemas.microsoft.com/office/drawing/2015/9/8/chartex" xmlns:cx2="http://schemas.microsoft.com/office/drawing/2015/10/21/chartex" xmlns:cx3="http://schemas.microsoft.com/office/drawing/2016/5/9/chartex" xmlns:cx4="http://schemas.microsoft.com/office/drawing/2016/5/10/chartex" xmlns:cx5="http://schemas.microsoft.com/office/drawing/2016/5/11/chartex" xmlns:cx6="http://schemas.microsoft.com/office/drawing/2016/5/12/chartex" xmlns:cx7="http://schemas.microsoft.com/office/drawing/2016/5/13/chartex" xmlns:cx8="http://schemas.microsoft.com/office/drawing/2016/5/14/chartex" xmlns:mc="http://schemas.openxmlformats.org/markup-compatibility/2006" xmlns:aink="http://schemas.microsoft.com/office/drawing/2016/ink" xmlns:am3d="http://schemas.microsoft.com/office/drawing/2017/model3d" xmlns:o="urn:schemas-microsoft-com:office:office" xmlns:oel="http://schemas.microsoft.com/office/2019/extlst" xmlns:r="http://schemas.openxmlformats.org/officeDocument/2006/relationships" xmlns:m="http://schemas.openxmlformats.org/officeDocument/2006/math" xmlns:v="urn:schemas-microsoft-com:vml" xmlns:wp14="http://schemas.microsoft.com/office/word/2010/wordprocessingDrawing" xmlns:wp="http://schemas.openxmlformats.org/drawingml/2006/wordprocessingDrawing" xmlns:w10="urn:schemas-microsoft-com:office:word" xmlns:w="http://schemas.openxmlformats.org/wordprocessingml/2006/main" xmlns:w14="http://schemas.microsoft.com/office/word/2010/wordml" xmlns:w15="http://schemas.microsoft.com/office/word/2012/wordml" xmlns:w16cex="http://schemas.microsoft.com/office/word/2018/wordml/cex" xmlns:w16cid="http://schemas.microsoft.com/office/word/2016/wordml/cid" xmlns:w16="http://schemas.microsoft.com/office/word/2018/wordml" xmlns:w16sdtdh="http://schemas.microsoft.com/office/word/2020/wordml/sdtdatahash" xmlns:w16se="http://schemas.microsoft.com/office/word/2015/wordml/symex" xmlns:wpg="http://schemas.microsoft.com/office/word/2010/wordprocessingGroup" xmlns:wpi="http://schemas.microsoft.com/office/word/2010/wordprocessingInk" xmlns:wne="http://schemas.microsoft.com/office/word/2006/wordml" xmlns:wps="http://schemas.microsoft.com/office/word/2010/wordprocessingShape" mc:Ignorable="w14 w15 w16se w16cid w16 w16cex w16sdtdh wp14">
+<w:numbering xmlns:wpc="http://schemas.microsoft.com/office/word/2010/wordprocessingCanvas" xmlns:cx="http://schemas.microsoft.com/office/drawing/2014/chartex" xmlns:cx1="http://schemas.microsoft.com/office/drawing/2015/9/8/chartex" xmlns:cx2="http://schemas.microsoft.com/office/drawing/2015/10/21/chartex" xmlns:cx3="http://schemas.microsoft.com/office/drawing/2016/5/9/chartex" xmlns:cx4="http://schemas.microsoft.com/office/drawing/2016/5/10/chartex" xmlns:cx5="http://schemas.microsoft.com/office/drawing/2016/5/11/chartex" xmlns:cx6="http://schemas.microsoft.com/office/drawing/2016/5/12/chartex" xmlns:cx7="http://schemas.microsoft.com/office/drawing/2016/5/13/chartex" xmlns:cx8="http://schemas.microsoft.com/office/drawing/2016/5/14/chartex" xmlns:mc="http://schemas.openxmlformats.org/markup-compatibility/2006" xmlns:aink="http://schemas.microsoft.com/office/drawing/2016/ink" xmlns:am3d="http://schemas.microsoft.com/office/drawing/2017/model3d" xmlns:o="urn:schemas-microsoft-com:office:office" xmlns:oel="http://schemas.microsoft.com/office/2019/extlst" xmlns:r="http://schemas.openxmlformats.org/officeDocument/2006/relationships" xmlns:m="http://schemas.openxmlformats.org/officeDocument/2006/math" xmlns:v="urn:schemas-microsoft-com:vml" xmlns:wp14="http://schemas.microsoft.com/office/word/2010/wordprocessingDrawing" xmlns:wp="http://schemas.openxmlformats.org/drawingml/2006/wordprocessingDrawing" xmlns:w10="urn:schemas-microsoft-com:office:word" xmlns:w="http://schemas.openxmlformats.org/wordprocessingml/2006/main" xmlns:w14="http://schemas.microsoft.com/office/word/2010/wordml" xmlns:w15="http://schemas.microsoft.com/office/word/2012/wordml" xmlns:w16cex="http://schemas.microsoft.com/office/word/2018/wordml/cex" xmlns:w16cid="http://schemas.microsoft.com/office/word/2016/wordml/cid" xmlns:w16="http://schemas.microsoft.com/office/word/2018/wordml" xmlns:w16du="http://schemas.microsoft.com/office/word/2023/wordml/word16du" xmlns:w16sdtdh="http://schemas.microsoft.com/office/word/2020/wordml/sdtdatahash" xmlns:w16sdtfl="http://schemas.microsoft.com/office/word/2024/wordml/sdtformatlock" xmlns:w16se="http://schemas.microsoft.com/office/word/2015/wordml/symex" xmlns:wpg="http://schemas.microsoft.com/office/word/2010/wordprocessingGroup" xmlns:wpi="http://schemas.microsoft.com/office/word/2010/wordprocessingInk" xmlns:wne="http://schemas.microsoft.com/office/word/2006/wordml" xmlns:wps="http://schemas.microsoft.com/office/word/2010/wordprocessingShape" mc:Ignorable="w14 w15 w16se w16cid w16 w16cex w16sdtdh w16sdtfl w16du wp14">
   <w:abstractNum w:abstractNumId="0" w15:restartNumberingAfterBreak="0">
     <w:nsid w:val="19394FDD"/>
     <w:multiLevelType w:val="hybridMultilevel"/>
@@ -1802,7 +1783,7 @@
 </file>
 
 <file path=word/styles.xml><?xml version="1.0" encoding="utf-8"?>
-<w:styles xmlns:mc="http://schemas.openxmlformats.org/markup-compatibility/2006" xmlns:r="http://schemas.openxmlformats.org/officeDocument/2006/relationships" xmlns:w="http://schemas.openxmlformats.org/wordprocessingml/2006/main" xmlns:w14="http://schemas.microsoft.com/office/word/2010/wordml" xmlns:w15="http://schemas.microsoft.com/office/word/2012/wordml" xmlns:w16cex="http://schemas.microsoft.com/office/word/2018/wordml/cex" xmlns:w16cid="http://schemas.microsoft.com/office/word/2016/wordml/cid" xmlns:w16="http://schemas.microsoft.com/office/word/2018/wordml" xmlns:w16sdtdh="http://schemas.microsoft.com/office/word/2020/wordml/sdtdatahash" xmlns:w16se="http://schemas.microsoft.com/office/word/2015/wordml/symex" mc:Ignorable="w14 w15 w16se w16cid w16 w16cex w16sdtdh">
+<w:styles xmlns:mc="http://schemas.openxmlformats.org/markup-compatibility/2006" xmlns:r="http://schemas.openxmlformats.org/officeDocument/2006/relationships" xmlns:w="http://schemas.openxmlformats.org/wordprocessingml/2006/main" xmlns:w14="http://schemas.microsoft.com/office/word/2010/wordml" xmlns:w15="http://schemas.microsoft.com/office/word/2012/wordml" xmlns:w16cex="http://schemas.microsoft.com/office/word/2018/wordml/cex" xmlns:w16cid="http://schemas.microsoft.com/office/word/2016/wordml/cid" xmlns:w16="http://schemas.microsoft.com/office/word/2018/wordml" xmlns:w16du="http://schemas.microsoft.com/office/word/2023/wordml/word16du" xmlns:w16sdtdh="http://schemas.microsoft.com/office/word/2020/wordml/sdtdatahash" xmlns:w16sdtfl="http://schemas.microsoft.com/office/word/2024/wordml/sdtformatlock" xmlns:w16se="http://schemas.microsoft.com/office/word/2015/wordml/symex" mc:Ignorable="w14 w15 w16se w16cid w16 w16cex w16sdtdh w16sdtfl w16du">
   <w:docDefaults>
     <w:rPrDefault>
       <w:rPr>
@@ -2638,10 +2619,6 @@
 </file>
 
 <file path=customXml/item1.xml><?xml version="1.0" encoding="utf-8"?>
-<b:Sources xmlns:b="http://schemas.openxmlformats.org/officeDocument/2006/bibliography" SelectedStyle="\apa.xsl" StyleName="APA" Version="6"/>
-</file>
-
-<file path=customXml/item2.xml><?xml version="1.0" encoding="utf-8"?>
 <?mso-contentType ?>
 <FormTemplates xmlns="http://schemas.microsoft.com/sharepoint/v3/contenttype/forms">
   <Display>DocumentLibraryForm</Display>
@@ -2650,18 +2627,22 @@
 </FormTemplates>
 </file>
 
+<file path=customXml/item2.xml><?xml version="1.0" encoding="utf-8"?>
+<b:Sources xmlns:b="http://schemas.openxmlformats.org/officeDocument/2006/bibliography" SelectedStyle="\apa.xsl" StyleName="APA" Version="6"/>
+</file>
+
 <file path=customXml/itemProps1.xml><?xml version="1.0" encoding="utf-8"?>
+<ds:datastoreItem xmlns:ds="http://schemas.openxmlformats.org/officeDocument/2006/customXml" ds:itemID="{C6214E07-0DC6-4CB8-99B6-0AA9826BC3F4}">
+  <ds:schemaRefs>
+    <ds:schemaRef ds:uri="http://schemas.microsoft.com/sharepoint/v3/contenttype/forms"/>
+  </ds:schemaRefs>
+</ds:datastoreItem>
+</file>
+
+<file path=customXml/itemProps2.xml><?xml version="1.0" encoding="utf-8"?>
 <ds:datastoreItem xmlns:ds="http://schemas.openxmlformats.org/officeDocument/2006/customXml" ds:itemID="{EF38EFE1-32FE-4DCD-B198-0481B7DD594A}">
   <ds:schemaRefs>
     <ds:schemaRef ds:uri="http://schemas.openxmlformats.org/officeDocument/2006/bibliography"/>
   </ds:schemaRefs>
 </ds:datastoreItem>
-</file>
-
-<file path=customXml/itemProps2.xml><?xml version="1.0" encoding="utf-8"?>
-<ds:datastoreItem xmlns:ds="http://schemas.openxmlformats.org/officeDocument/2006/customXml" ds:itemID="{C6214E07-0DC6-4CB8-99B6-0AA9826BC3F4}">
-  <ds:schemaRefs>
-    <ds:schemaRef ds:uri="http://schemas.microsoft.com/sharepoint/v3/contenttype/forms"/>
-  </ds:schemaRefs>
-</ds:datastoreItem>
 </file>
</xml_diff>

<commit_message>
Add Rosh Chodesh day detection and times (Shacharit at 06:05)
</commit_message>
<xml_diff>
--- a/resources/templates/shabbat.docx
+++ b/resources/templates/shabbat.docx
@@ -1193,6 +1193,53 @@
           <w:szCs w:val="32"/>
         </w:rPr>
         <w:t>{week_shacharit_3}</w:t>
+      </w:r>
+      <w:r>
+        <w:rPr>
+          <w:rFonts w:ascii="Tahoma" w:hAnsi="Tahoma" w:cs="Tahoma"/>
+          <w:color w:val="864904" w:themeColor="accent3" w:themeShade="80"/>
+          <w:sz w:val="32"/>
+          <w:szCs w:val="32"/>
+        </w:rPr>
+        <w:t>{#has_rosh_chodesh}</w:t>
+      </w:r>
+      <w:r>
+        <w:rPr>
+          <w:rFonts w:ascii="Tahoma" w:hAnsi="Tahoma" w:cs="Tahoma" w:hint="cs"/>
+          <w:color w:val="864904" w:themeColor="accent3" w:themeShade="80"/>
+          <w:sz w:val="32"/>
+          <w:szCs w:val="32"/>
+          <w:rtl/>
+        </w:rPr>
+        <w:t xml:space="preserve">, ר"ח (</w:t>
+      </w:r>
+      <w:r>
+        <w:rPr>
+          <w:rFonts w:ascii="Tahoma" w:hAnsi="Tahoma" w:cs="Tahoma"/>
+          <w:color w:val="864904" w:themeColor="accent3" w:themeShade="80"/>
+          <w:sz w:val="32"/>
+          <w:szCs w:val="32"/>
+        </w:rPr>
+        <w:t>{rosh_chodesh_days_str}</w:t>
+      </w:r>
+      <w:r>
+        <w:rPr>
+          <w:rFonts w:ascii="Tahoma" w:hAnsi="Tahoma" w:cs="Tahoma" w:hint="cs"/>
+          <w:color w:val="864904" w:themeColor="accent3" w:themeShade="80"/>
+          <w:sz w:val="32"/>
+          <w:szCs w:val="32"/>
+          <w:rtl/>
+        </w:rPr>
+        <w:t xml:space="preserve">) </w:t>
+      </w:r>
+      <w:r>
+        <w:rPr>
+          <w:rFonts w:ascii="Tahoma" w:hAnsi="Tahoma" w:cs="Tahoma"/>
+          <w:color w:val="864904" w:themeColor="accent3" w:themeShade="80"/>
+          <w:sz w:val="32"/>
+          <w:szCs w:val="32"/>
+        </w:rPr>
+        <w:t>{week_shacharit_rh}{/has_rosh_chodesh}</w:t>
       </w:r>
     </w:p>
     <w:p>

</xml_diff>

<commit_message>
Add Selichot detection and times (05:55 in Elul, 05:50 in Aseret Yemei Teshuva)
</commit_message>
<xml_diff>
--- a/resources/templates/shabbat.docx
+++ b/resources/templates/shabbat.docx
@@ -1087,6 +1087,65 @@
           <w:szCs w:val="32"/>
         </w:rPr>
       </w:pPr>
+    </w:p>
+    <w:p>
+      <w:pPr>
+        <w:pStyle w:val="List"/>
+        <w:rPr>
+          <w:rFonts w:ascii="Tahoma" w:hAnsi="Tahoma" w:cs="Tahoma"/>
+          <w:color w:val="864904" w:themeColor="accent3" w:themeShade="80"/>
+          <w:sz w:val="32"/>
+          <w:szCs w:val="32"/>
+        </w:rPr>
+      </w:pPr>
+      <w:r>
+        <w:rPr>
+          <w:rFonts w:ascii="Tahoma" w:hAnsi="Tahoma" w:cs="Tahoma"/>
+          <w:color w:val="864904" w:themeColor="accent3" w:themeShade="80"/>
+          <w:sz w:val="32"/>
+          <w:szCs w:val="32"/>
+        </w:rPr>
+        <w:t>{#has_selichot}</w:t>
+      </w:r>
+      <w:r>
+        <w:rPr>
+          <w:rFonts w:ascii="Tahoma" w:hAnsi="Tahoma" w:cs="Tahoma" w:hint="cs"/>
+          <w:color w:val="864904" w:themeColor="accent3" w:themeShade="80"/>
+          <w:sz w:val="32"/>
+          <w:szCs w:val="32"/>
+          <w:rtl/>
+        </w:rPr>
+        <w:t xml:space="preserve">סליחות </w:t>
+      </w:r>
+      <w:r>
+        <w:rPr>
+          <w:rFonts w:ascii="Tahoma" w:hAnsi="Tahoma" w:cs="Tahoma"/>
+          <w:color w:val="864904" w:themeColor="accent3" w:themeShade="80"/>
+          <w:sz w:val="32"/>
+          <w:szCs w:val="32"/>
+          <w:rtl/>
+        </w:rPr>
+        <w:t>–</w:t>
+      </w:r>
+      <w:r>
+        <w:rPr>
+          <w:rFonts w:ascii="Tahoma" w:hAnsi="Tahoma" w:cs="Tahoma" w:hint="cs"/>
+          <w:color w:val="864904" w:themeColor="accent3" w:themeShade="80"/>
+          <w:sz w:val="32"/>
+          <w:szCs w:val="32"/>
+          <w:rtl/>
+        </w:rPr>
+        <w:t xml:space="preserve"> </w:t>
+      </w:r>
+      <w:r>
+        <w:rPr>
+          <w:rFonts w:ascii="Tahoma" w:hAnsi="Tahoma" w:cs="Tahoma"/>
+          <w:color w:val="864904" w:themeColor="accent3" w:themeShade="80"/>
+          <w:sz w:val="32"/>
+          <w:szCs w:val="32"/>
+        </w:rPr>
+        <w:t>{week_selichot}{/has_selichot}</w:t>
+      </w:r>
     </w:p>
     <w:p>
       <w:pPr>

</xml_diff>

<commit_message>
Add Fast days detection and times (Shacharit at 06:05 / 9 Av 07:00 & 08:30, Arvit at Shkia+18, exclude Erev Yom Kippur from Selichot)
</commit_message>
<xml_diff>
--- a/resources/templates/shabbat.docx
+++ b/resources/templates/shabbat.docx
@@ -1300,6 +1300,34 @@
         </w:rPr>
         <w:t>{week_shacharit_rh}{/has_rosh_chodesh}</w:t>
       </w:r>
+      <w:r>
+        <w:rPr>
+          <w:rFonts w:ascii="Tahoma" w:hAnsi="Tahoma" w:cs="Tahoma"/>
+          <w:color w:val="864904" w:themeColor="accent3" w:themeShade="80"/>
+          <w:sz w:val="32"/>
+          <w:szCs w:val="32"/>
+        </w:rPr>
+        <w:t>{#has_fast}</w:t>
+      </w:r>
+      <w:r>
+        <w:rPr>
+          <w:rFonts w:ascii="Tahoma" w:hAnsi="Tahoma" w:cs="Tahoma" w:hint="cs"/>
+          <w:color w:val="864904" w:themeColor="accent3" w:themeShade="80"/>
+          <w:sz w:val="32"/>
+          <w:szCs w:val="32"/>
+          <w:rtl/>
+        </w:rPr>
+        <w:t xml:space="preserve">, </w:t>
+      </w:r>
+      <w:r>
+        <w:rPr>
+          <w:rFonts w:ascii="Tahoma" w:hAnsi="Tahoma" w:cs="Tahoma"/>
+          <w:color w:val="864904" w:themeColor="accent3" w:themeShade="80"/>
+          <w:sz w:val="32"/>
+          <w:szCs w:val="32"/>
+        </w:rPr>
+        <w:t>{fast_name} ({fast_days_str}) {week_shacharit_fast}{/has_fast}</w:t>
+      </w:r>
     </w:p>
     <w:p>
       <w:pPr>
@@ -1419,6 +1447,34 @@
           <w:szCs w:val="32"/>
         </w:rPr>
         <w:t>{week_arvit_1}</w:t>
+      </w:r>
+      <w:r>
+        <w:rPr>
+          <w:rFonts w:ascii="Tahoma" w:hAnsi="Tahoma" w:cs="Tahoma"/>
+          <w:color w:val="864904" w:themeColor="accent3" w:themeShade="80"/>
+          <w:sz w:val="32"/>
+          <w:szCs w:val="32"/>
+        </w:rPr>
+        <w:t>{#has_fast}</w:t>
+      </w:r>
+      <w:r>
+        <w:rPr>
+          <w:rFonts w:ascii="Tahoma" w:hAnsi="Tahoma" w:cs="Tahoma" w:hint="cs"/>
+          <w:color w:val="864904" w:themeColor="accent3" w:themeShade="80"/>
+          <w:sz w:val="32"/>
+          <w:szCs w:val="32"/>
+          <w:rtl/>
+        </w:rPr>
+        <w:t xml:space="preserve">, מוצאי </w:t>
+      </w:r>
+      <w:r>
+        <w:rPr>
+          <w:rFonts w:ascii="Tahoma" w:hAnsi="Tahoma" w:cs="Tahoma"/>
+          <w:color w:val="864904" w:themeColor="accent3" w:themeShade="80"/>
+          <w:sz w:val="32"/>
+          <w:szCs w:val="32"/>
+        </w:rPr>
+        <w:t>{fast_name} {fast_arvit}{/has_fast}</w:t>
       </w:r>
     </w:p>
     <w:sectPr>

</xml_diff>

<commit_message>
Add Shabbat Mevarchim detection and title label in flyer
</commit_message>
<xml_diff>
--- a/resources/templates/shabbat.docx
+++ b/resources/templates/shabbat.docx
@@ -163,6 +163,40 @@
           <w:lang w:val="en-GB"/>
         </w:rPr>
         <w:t>{parsha}</w:t>
+      </w:r>
+      <w:r>
+        <w:rPr>
+          <w:rFonts w:ascii="Tahoma" w:hAnsi="Tahoma" w:cs="Tahoma"/>
+          <w:b/>
+          <w:bCs/>
+          <w:color w:val="864904" w:themeColor="accent3" w:themeShade="80"/>
+          <w:sz w:val="52"/>
+          <w:szCs w:val="52"/>
+        </w:rPr>
+        <w:t>{#is_shabbat_mevarchim}</w:t>
+      </w:r>
+      <w:r>
+        <w:rPr>
+          <w:rFonts w:ascii="Tahoma" w:hAnsi="Tahoma" w:cs="Tahoma" w:hint="cs"/>
+          <w:b/>
+          <w:bCs/>
+          <w:color w:val="864904" w:themeColor="accent3" w:themeShade="80"/>
+          <w:sz w:val="52"/>
+          <w:szCs w:val="52"/>
+          <w:rtl/>
+        </w:rPr>
+        <w:t xml:space="preserve"> – שבת מברכים</w:t>
+      </w:r>
+      <w:r>
+        <w:rPr>
+          <w:rFonts w:ascii="Tahoma" w:hAnsi="Tahoma" w:cs="Tahoma"/>
+          <w:b/>
+          <w:bCs/>
+          <w:color w:val="864904" w:themeColor="accent3" w:themeShade="80"/>
+          <w:sz w:val="52"/>
+          <w:szCs w:val="52"/>
+        </w:rPr>
+        <w:t>{/is_shabbat_mevarchim}</w:t>
       </w:r>
       <w:r>
         <w:rPr>

</xml_diff>

<commit_message>
Add Chol HaMoed times, Fast Mincha, Tzom Gedaliah Selichot (05:45), and TIMES_RULES.md
</commit_message>
<xml_diff>
--- a/resources/templates/shabbat.docx
+++ b/resources/templates/shabbat.docx
@@ -1178,7 +1178,7 @@
           <w:sz w:val="32"/>
           <w:szCs w:val="32"/>
         </w:rPr>
-        <w:t>{week_selichot}{/has_selichot}</w:t>
+        <w:t>{#has_tzom_gedaliah}צום גדליה ({tzom_gedaliah_day_str}) {tzom_gedaliah_selichot}{#has_other_selichot}, שאר הימים {week_selichot}{/has_other_selichot}{/has_tzom_gedaliah}{^has_tzom_gedaliah}{week_selichot}{/has_tzom_gedaliah}{/has_selichot}</w:t>
       </w:r>
     </w:p>
     <w:p>
@@ -1410,27 +1410,35 @@
           <w:sz w:val="32"/>
           <w:szCs w:val="32"/>
         </w:rPr>
-        <w:t>{</w:t>
-      </w:r>
-      <w:proofErr w:type="spellStart"/>
-      <w:r>
-        <w:rPr>
-          <w:rFonts w:ascii="Tahoma" w:hAnsi="Tahoma" w:cs="Tahoma"/>
-          <w:color w:val="864904" w:themeColor="accent3" w:themeShade="80"/>
-          <w:sz w:val="32"/>
-          <w:szCs w:val="32"/>
-        </w:rPr>
-        <w:t>week_mincha</w:t>
-      </w:r>
-      <w:proofErr w:type="spellEnd"/>
-      <w:r>
-        <w:rPr>
-          <w:rFonts w:ascii="Tahoma" w:hAnsi="Tahoma" w:cs="Tahoma"/>
-          <w:color w:val="864904" w:themeColor="accent3" w:themeShade="80"/>
-          <w:sz w:val="32"/>
-          <w:szCs w:val="32"/>
-        </w:rPr>
-        <w:t>}</w:t>
+        <w:t>{week_mincha}</w:t>
+      </w:r>
+      <w:r>
+        <w:rPr>
+          <w:rFonts w:ascii="Tahoma" w:hAnsi="Tahoma" w:cs="Tahoma"/>
+          <w:color w:val="864904" w:themeColor="accent3" w:themeShade="80"/>
+          <w:sz w:val="32"/>
+          <w:szCs w:val="32"/>
+        </w:rPr>
+        <w:t>{#has_fast}</w:t>
+      </w:r>
+      <w:r>
+        <w:rPr>
+          <w:rFonts w:ascii="Tahoma" w:hAnsi="Tahoma" w:cs="Tahoma" w:hint="cs"/>
+          <w:color w:val="864904" w:themeColor="accent3" w:themeShade="80"/>
+          <w:sz w:val="32"/>
+          <w:szCs w:val="32"/>
+          <w:rtl/>
+        </w:rPr>
+        <w:t xml:space="preserve">, </w:t>
+      </w:r>
+      <w:r>
+        <w:rPr>
+          <w:rFonts w:ascii="Tahoma" w:hAnsi="Tahoma" w:cs="Tahoma"/>
+          <w:color w:val="864904" w:themeColor="accent3" w:themeShade="80"/>
+          <w:sz w:val="32"/>
+          <w:szCs w:val="32"/>
+        </w:rPr>
+        <w:t>{fast_name} {fast_mincha}{/has_fast}</w:t>
       </w:r>
     </w:p>
     <w:p>

</xml_diff>

<commit_message>
Disable Women's Shiur on Shabbat Chol HaMoed across all formats and update TIMES_RULES.md
</commit_message>
<xml_diff>
--- a/resources/templates/shabbat.docx
+++ b/resources/templates/shabbat.docx
@@ -655,74 +655,15 @@
       </w:pPr>
       <w:r>
         <w:rPr>
-          <w:rFonts w:ascii="Tahoma" w:hAnsi="Tahoma" w:cs="Tahoma" w:hint="cs"/>
-          <w:b/>
-          <w:bCs/>
-          <w:color w:val="864904" w:themeColor="accent3" w:themeShade="80"/>
-          <w:sz w:val="36"/>
-          <w:szCs w:val="36"/>
-          <w:rtl/>
-        </w:rPr>
-        <w:t xml:space="preserve">שיעור לנשים </w:t>
-      </w:r>
-      <w:r>
-        <w:rPr>
-          <w:rFonts w:ascii="Tahoma" w:hAnsi="Tahoma" w:cs="Tahoma"/>
-          <w:b/>
-          <w:bCs/>
-          <w:color w:val="864904" w:themeColor="accent3" w:themeShade="80"/>
-          <w:sz w:val="36"/>
-          <w:szCs w:val="36"/>
-          <w:rtl/>
-        </w:rPr>
-        <w:t>–</w:t>
-      </w:r>
-      <w:r>
-        <w:rPr>
-          <w:rFonts w:ascii="Tahoma" w:hAnsi="Tahoma" w:cs="Tahoma" w:hint="cs"/>
-          <w:b/>
-          <w:bCs/>
-          <w:color w:val="864904" w:themeColor="accent3" w:themeShade="80"/>
-          <w:sz w:val="36"/>
-          <w:szCs w:val="36"/>
-          <w:rtl/>
-        </w:rPr>
-        <w:t xml:space="preserve"> </w:t>
-      </w:r>
-      <w:r>
-        <w:rPr>
-          <w:rFonts w:ascii="Tahoma" w:hAnsi="Tahoma" w:cs="Tahoma"/>
-          <w:b/>
-          <w:bCs/>
-          <w:color w:val="864904" w:themeColor="accent3" w:themeShade="80"/>
-          <w:sz w:val="36"/>
-          <w:szCs w:val="36"/>
-        </w:rPr>
-        <w:t>{</w:t>
-      </w:r>
-      <w:proofErr w:type="spellStart"/>
-      <w:r>
-        <w:rPr>
-          <w:rFonts w:ascii="Tahoma" w:hAnsi="Tahoma" w:cs="Tahoma"/>
-          <w:b/>
-          <w:bCs/>
-          <w:color w:val="864904" w:themeColor="accent3" w:themeShade="80"/>
-          <w:sz w:val="36"/>
-          <w:szCs w:val="36"/>
-        </w:rPr>
-        <w:t>day_womens_shiur</w:t>
-      </w:r>
-      <w:proofErr w:type="spellEnd"/>
-      <w:r>
-        <w:rPr>
-          <w:rFonts w:ascii="Tahoma" w:hAnsi="Tahoma" w:cs="Tahoma"/>
-          <w:b/>
-          <w:bCs/>
-          <w:color w:val="864904" w:themeColor="accent3" w:themeShade="80"/>
-          <w:sz w:val="36"/>
-          <w:szCs w:val="36"/>
-        </w:rPr>
-        <w:t>}</w:t>
+          <w:rFonts w:ascii="Tahoma" w:hAnsi="Tahoma" w:cs="Tahoma"/>
+          <w:b/>
+          <w:bCs/>
+          <w:color w:val="864904" w:themeColor="accent3" w:themeShade="80"/>
+          <w:sz w:val="36"/>
+          <w:szCs w:val="36"/>
+          <w:rtl/>
+        </w:rPr>
+        <w:t>{#day_womens_shiur}שיעור לנשים – {day_womens_shiur}{/day_womens_shiur}</w:t>
       </w:r>
     </w:p>
     <w:p>

</xml_diff>